<commit_message>
feat(rendering): engine-agnostic LaTeX pipeline, mermaid render tests, copy/manifest hardening
Inherited in-flight work package (codex session, now landed): engine-agnostic
LaTeX command assembly + stdout log rename, stricter fatal-error handling,
chrome/latex_utils updates, web renderer publication-links support,
symlinks=False on deliverable copytree (no dangling symlink artifacts),
empty-manifest guard in output validation, new test_pdf_mermaid.py suite.
Verified: tests/infra_tests/rendering/ + core pipeline-control — 919 passed,
1 skipped. template_code_project outputs re-rendered by the new pipeline.
</commit_message>
<xml_diff>
--- a/projects/templates/template_code_project/output/docx/templates/template_code_project_combined.docx
+++ b/projects/templates/template_code_project/output/docx/templates/template_code_project_combined.docx
@@ -12856,7 +12856,7 @@
         <w:t xml:space="preserve">Generated</w:t>
       </w:r>
       <w:r>
-        <w:t xml:space="preserve">: 2026-07-08T02:12:25Z</w:t>
+        <w:t xml:space="preserve">: 2026-07-10T14:33:59Z</w:t>
       </w:r>
     </w:p>
     <w:bookmarkEnd w:id="110"/>
@@ -13684,7 +13684,7 @@
               <w:pStyle w:val="Compact"/>
             </w:pPr>
             <w:r>
-              <w:t xml:space="preserve">8</w:t>
+              <w:t xml:space="preserve">9</w:t>
             </w:r>
           </w:p>
         </w:tc>
@@ -13732,7 +13732,7 @@
               <w:pStyle w:val="Compact"/>
             </w:pPr>
             <w:r>
-              <w:t xml:space="preserve">9</w:t>
+              <w:t xml:space="preserve">19</w:t>
             </w:r>
           </w:p>
         </w:tc>
@@ -13764,7 +13764,7 @@
                 <w:b/>
                 <w:bCs/>
               </w:rPr>
-              <w:t xml:space="preserve">22</w:t>
+              <w:t xml:space="preserve">33</w:t>
             </w:r>
           </w:p>
         </w:tc>

</xml_diff>

<commit_message>
feat(code-exemplar): harden numerical termination reporting
</commit_message>
<xml_diff>
--- a/projects/templates/template_code_project/output/docx/templates/template_code_project_combined.docx
+++ b/projects/templates/template_code_project/output/docx/templates/template_code_project_combined.docx
@@ -4323,10 +4323,7 @@
         <w:t xml:space="preserve">experiment.tolerance</w:t>
       </w:r>
       <w:r>
-        <w:t xml:space="preserve"> </w:t>
-      </w:r>
-      <w:r>
-        <w:t xml:space="preserve">or when</w:t>
+        <w:t xml:space="preserve">, when</w:t>
       </w:r>
       <w:r>
         <w:t xml:space="preserve"> </w:t>
@@ -4352,7 +4349,7 @@
         <w:t xml:space="preserve">experiment.max_iterations</w:t>
       </w:r>
       <w:r>
-        <w:t xml:space="preserve">. The boolean</w:t>
+        <w:t xml:space="preserve">, or when an objective, gradient, or update becomes non-finite. The boolean</w:t>
       </w:r>
       <w:r>
         <w:t xml:space="preserve"> </w:t>
@@ -4367,7 +4364,34 @@
         <w:t xml:space="preserve"> </w:t>
       </w:r>
       <w:r>
-        <w:t xml:space="preserve">in exported CSV rows distinguishes these outcomes. Downstream,</w:t>
+        <w:t xml:space="preserve">plus</w:t>
+      </w:r>
+      <w:r>
+        <w:t xml:space="preserve"> </w:t>
+      </w:r>
+      <w:r>
+        <w:rPr>
+          <w:rStyle w:val="VerbatimChar"/>
+        </w:rPr>
+        <w:t xml:space="preserve">termination_reason</w:t>
+      </w:r>
+      <w:r>
+        <w:t xml:space="preserve"> </w:t>
+      </w:r>
+      <w:r>
+        <w:t xml:space="preserve">in exported CSV rows distinguish these outcomes. A non-finite candidate is rejected before it enters</w:t>
+      </w:r>
+      <w:r>
+        <w:t xml:space="preserve"> </w:t>
+      </w:r>
+      <w:r>
+        <w:rPr>
+          <w:rStyle w:val="VerbatimChar"/>
+        </w:rPr>
+        <w:t xml:space="preserve">objective_history</w:t>
+      </w:r>
+      <w:r>
+        <w:t xml:space="preserve">, preserving the last finite state for reproducible reporting. Downstream,</w:t>
       </w:r>
       <w:r>
         <w:t xml:space="preserve"> </w:t>
@@ -5962,7 +5986,7 @@
         </m:r>
       </m:oMath>
       <w:r>
-        <w:t xml:space="preserve">, and the</w:t>
+        <w:t xml:space="preserve">, the</w:t>
       </w:r>
       <w:r>
         <w:t xml:space="preserve"> </w:t>
@@ -6045,71 +6069,22 @@
         </m:sSup>
       </m:oMath>
       <w:r>
-        <w:t xml:space="preserve">. Rows marked</w:t>
-      </w:r>
-      <w:r>
-        <w:t xml:space="preserve"> </w:t>
-      </w:r>
-      <w:r>
-        <w:t xml:space="preserve">“No”</w:t>
-      </w:r>
-      <w:r>
-        <w:t xml:space="preserve"> </w:t>
-      </w:r>
-      <w:r>
-        <w:t xml:space="preserve">either hit the iteration cap before meeting the gradient tolerance (small</w:t>
-      </w:r>
-      <w:r>
-        <w:t xml:space="preserve"> </w:t>
-      </w:r>
-      <m:oMath>
-        <m:r>
-          <m:t>α</m:t>
-        </m:r>
-      </m:oMath>
-      <w:r>
-        <w:t xml:space="preserve">) or correspond to unstable dynamics when</w:t>
-      </w:r>
-      <w:r>
-        <w:t xml:space="preserve"> </w:t>
-      </w:r>
-      <m:oMath>
-        <m:r>
-          <m:rPr>
-            <m:sty m:val="p"/>
-          </m:rPr>
-          <m:t>|</m:t>
-        </m:r>
-        <m:r>
-          <m:t>1</m:t>
-        </m:r>
-        <m:r>
-          <m:rPr>
-            <m:sty m:val="p"/>
-          </m:rPr>
-          <m:t>−</m:t>
-        </m:r>
-        <m:r>
-          <m:t>α</m:t>
-        </m:r>
-        <m:r>
-          <m:rPr>
-            <m:sty m:val="p"/>
-          </m:rPr>
-          <m:t>|</m:t>
-        </m:r>
-        <m:r>
-          <m:rPr>
-            <m:sty m:val="p"/>
-          </m:rPr>
-          <m:t>≥</m:t>
-        </m:r>
-        <m:r>
-          <m:t>1</m:t>
-        </m:r>
-      </m:oMath>
-      <w:r>
-        <w:t xml:space="preserve">.</w:t>
+        <w:t xml:space="preserve">, and its structured termination reason. A</w:t>
+      </w:r>
+      <w:r>
+        <w:t xml:space="preserve"> </w:t>
+      </w:r>
+      <w:r>
+        <w:rPr>
+          <w:rStyle w:val="VerbatimChar"/>
+        </w:rPr>
+        <w:t xml:space="preserve">non_finite</w:t>
+      </w:r>
+      <w:r>
+        <w:t xml:space="preserve"> </w:t>
+      </w:r>
+      <w:r>
+        <w:t xml:space="preserve">row stops before an overflowing update is serialized and retains the last finite iterate.</w:t>
       </w:r>
     </w:p>
     <w:tbl>
@@ -6118,14 +6093,15 @@
         <w:tblW w:type="pct" w:w="5000"/>
         <w:tblLayout w:type="fixed"/>
         <w:tblLook w:firstRow="1" w:lastRow="0" w:firstColumn="0" w:lastColumn="0" w:noHBand="0" w:noVBand="0" w:val="0020"/>
-        <w:tblCaption w:val="Table 1: Gradient descent outcomes per configured step size: state at termination, iteration count capped by N_{\max} = 1000, and the converged flag from gradient_descent() using \|\nabla f\| &lt; 10^{-8}. Rows marked “No” either hit the iteration cap before meeting the gradient tolerance (small \alpha) or correspond to unstable dynamics when |1-\alpha| \geq 1."/>
+        <w:tblCaption w:val="Table 1: Gradient descent outcomes per configured step size: state at termination, iteration count capped by N_{\max} = 1000, the converged flag from gradient_descent() using \|\nabla f\| &lt; 10^{-8}, and its structured termination reason. A non_finite row stops before an overflowing update is serialized and retains the last finite iterate."/>
       </w:tblPr>
       <w:tblGrid>
-        <w:gridCol w:w="1673"/>
-        <w:gridCol w:w="1784"/>
-        <w:gridCol w:w="1896"/>
-        <w:gridCol w:w="1338"/>
-        <w:gridCol w:w="1227"/>
+        <w:gridCol w:w="1414"/>
+        <w:gridCol w:w="1508"/>
+        <w:gridCol w:w="1602"/>
+        <w:gridCol w:w="1131"/>
+        <w:gridCol w:w="1037"/>
+        <w:gridCol w:w="1225"/>
       </w:tblGrid>
       <w:tr>
         <w:trPr>
@@ -6186,6 +6162,17 @@
             </w:r>
           </w:p>
         </w:tc>
+        <w:tc>
+          <w:tcPr/>
+          <w:p>
+            <w:pPr>
+              <w:pStyle w:val="Compact"/>
+            </w:pPr>
+            <w:r>
+              <w:t xml:space="preserve">Termination</w:t>
+            </w:r>
+          </w:p>
+        </w:tc>
       </w:tr>
       <w:tr>
         <w:tc>
@@ -6240,6 +6227,17 @@
             </w:pPr>
             <w:r>
               <w:t xml:space="preserve">No</w:t>
+            </w:r>
+          </w:p>
+        </w:tc>
+        <w:tc>
+          <w:tcPr/>
+          <w:p>
+            <w:pPr>
+              <w:pStyle w:val="Compact"/>
+            </w:pPr>
+            <w:r>
+              <w:t xml:space="preserve">max_iterations</w:t>
             </w:r>
           </w:p>
         </w:tc>
@@ -6300,6 +6298,17 @@
             </w:r>
           </w:p>
         </w:tc>
+        <w:tc>
+          <w:tcPr/>
+          <w:p>
+            <w:pPr>
+              <w:pStyle w:val="Compact"/>
+            </w:pPr>
+            <w:r>
+              <w:t xml:space="preserve">converged</w:t>
+            </w:r>
+          </w:p>
+        </w:tc>
       </w:tr>
       <w:tr>
         <w:tc>
@@ -6354,6 +6363,17 @@
             </w:pPr>
             <w:r>
               <w:t xml:space="preserve">Yes</w:t>
+            </w:r>
+          </w:p>
+        </w:tc>
+        <w:tc>
+          <w:tcPr/>
+          <w:p>
+            <w:pPr>
+              <w:pStyle w:val="Compact"/>
+            </w:pPr>
+            <w:r>
+              <w:t xml:space="preserve">converged</w:t>
             </w:r>
           </w:p>
         </w:tc>
@@ -6414,6 +6434,17 @@
             </w:r>
           </w:p>
         </w:tc>
+        <w:tc>
+          <w:tcPr/>
+          <w:p>
+            <w:pPr>
+              <w:pStyle w:val="Compact"/>
+            </w:pPr>
+            <w:r>
+              <w:t xml:space="preserve">converged</w:t>
+            </w:r>
+          </w:p>
+        </w:tc>
       </w:tr>
       <w:tr>
         <w:tc>
@@ -6471,6 +6502,17 @@
             </w:r>
           </w:p>
         </w:tc>
+        <w:tc>
+          <w:tcPr/>
+          <w:p>
+            <w:pPr>
+              <w:pStyle w:val="Compact"/>
+            </w:pPr>
+            <w:r>
+              <w:t xml:space="preserve">converged</w:t>
+            </w:r>
+          </w:p>
+        </w:tc>
       </w:tr>
       <w:tr>
         <w:tc>
@@ -6491,7 +6533,7 @@
               <w:pStyle w:val="Compact"/>
             </w:pPr>
             <w:r>
-              <w:t xml:space="preserve">-123384059690617745524091335813180186890505789975305907992186675554099100089605560395688521301527760116788345515894979896207548805638009361768752272295676536457470613583575384064.0000</w:t>
+              <w:t xml:space="preserve">-18027808360396904929014313133756094602021490593623455934143098782085898358268968910321926429082931340564236187769460640748166785144621899661251320903368704.0000</w:t>
             </w:r>
           </w:p>
         </w:tc>
@@ -6502,7 +6544,7 @@
               <w:pStyle w:val="Compact"/>
             </w:pPr>
             <w:r>
-              <w:t xml:space="preserve">inf</w:t>
+              <w:t xml:space="preserve">162500937139598269661779749391931612290431672893591152510335296183621559147095059174363943753278426469403184325060604037672721111493697147195103358138591980698705733738747223639633375614563987655337958785982898164996799665358767974385539800466556596391365426397418791309924510722911320257856182821332197572608.0000</w:t>
             </w:r>
           </w:p>
         </w:tc>
@@ -6513,7 +6555,7 @@
               <w:pStyle w:val="Compact"/>
             </w:pPr>
             <w:r>
-              <w:t xml:space="preserve">1000</w:t>
+              <w:t xml:space="preserve">876</w:t>
             </w:r>
           </w:p>
         </w:tc>
@@ -6525,6 +6567,17 @@
             </w:pPr>
             <w:r>
               <w:t xml:space="preserve">No</w:t>
+            </w:r>
+          </w:p>
+        </w:tc>
+        <w:tc>
+          <w:tcPr/>
+          <w:p>
+            <w:pPr>
+              <w:pStyle w:val="Compact"/>
+            </w:pPr>
+            <w:r>
+              <w:t xml:space="preserve">non_finite</w:t>
             </w:r>
           </w:p>
         </w:tc>
@@ -9557,7 +9610,7 @@
         <w:t xml:space="preserve"> </w:t>
       </w:r>
       <w:r>
-        <w:t xml:space="preserve">(1 iteration), average 372 iterations</w:t>
+        <w:t xml:space="preserve">(1 iteration), average 351 iterations</w:t>
       </w:r>
     </w:p>
     <w:p>
@@ -10664,7 +10717,7 @@
         </w:numPr>
       </w:pPr>
       <w:r>
-        <w:t xml:space="preserve">Mean iterations across rows in tbl. 1: 372</w:t>
+        <w:t xml:space="preserve">Mean iterations across rows in tbl. 1: 351</w:t>
       </w:r>
     </w:p>
     <w:p>
@@ -12673,7 +12726,7 @@
         <w:t xml:space="preserve">Python</w:t>
       </w:r>
       <w:r>
-        <w:t xml:space="preserve">: 3.12.13</w:t>
+        <w:t xml:space="preserve">: 3.13.11</w:t>
       </w:r>
     </w:p>
     <w:p>
@@ -12730,7 +12783,7 @@
         <w:t xml:space="preserve">Generated</w:t>
       </w:r>
       <w:r>
-        <w:t xml:space="preserve">: 2026-07-12T04:04:24Z</w:t>
+        <w:t xml:space="preserve">: 2026-07-20T15:59:12Z</w:t>
       </w:r>
     </w:p>
     <w:bookmarkEnd w:id="110"/>
@@ -13842,7 +13895,7 @@
         </w:numPr>
       </w:pPr>
       <w:r>
-        <w:t xml:space="preserve">Mean iterations across all rows: 372</w:t>
+        <w:t xml:space="preserve">Mean iterations across all rows: 351</w:t>
       </w:r>
     </w:p>
     <w:bookmarkEnd w:id="116"/>

</xml_diff>

<commit_message>
feat(template_code_project): scientific_reports figure alt-text + metadata
- src/analysis/scientific_reports.py: adds alt_text/metadata.source to
  generated figure entries.
- Full core pipeline regenerated to match: output/figures/figure_registry.json,
  manuscript, PDF/DOCX/EPUB/slides/web exports, and reports (artifact_manifest,
  evidence_registry, validation_report, output_statistics).
- output/web/dashboard.html now regenerates and survives the render stage
  (see the rendering commit's _clean_stale_web_artifacts fix) — previously
  this project-authored dashboard was silently deleted by the web-render
  cleanup step on every pipeline run.

Tests: test_analysis_coverage.py, test_analysis_integration.py extended; full
project suite 242/242 passing at 96.98% coverage (floor 90%).
</commit_message>
<xml_diff>
--- a/projects/templates/template_code_project/output/docx/templates/template_code_project_combined.docx
+++ b/projects/templates/template_code_project/output/docx/templates/template_code_project_combined.docx
@@ -4566,6 +4566,68 @@
       </w:r>
       <w:r>
         <w:t xml:space="preserve">. Captions in the markdown intentionally name the function and the key parameters (tolerance lines, grids, dimensions) so reviewers can navigate from PDF to code without inferring hidden defaults.</w:t>
+      </w:r>
+    </w:p>
+    <w:p>
+      <w:pPr>
+        <w:pStyle w:val="BodyText"/>
+      </w:pPr>
+      <w:r>
+        <w:t xml:space="preserve">The same generator writes explicit</w:t>
+      </w:r>
+      <w:r>
+        <w:t xml:space="preserve"> </w:t>
+      </w:r>
+      <w:r>
+        <w:rPr>
+          <w:rStyle w:val="VerbatimChar"/>
+        </w:rPr>
+        <w:t xml:space="preserve">metadata.alt_text</w:t>
+      </w:r>
+      <w:r>
+        <w:t xml:space="preserve"> </w:t>
+      </w:r>
+      <w:r>
+        <w:t xml:space="preserve">for every registered</w:t>
+      </w:r>
+      <w:r>
+        <w:t xml:space="preserve"> </w:t>
+      </w:r>
+      <w:r>
+        <w:t xml:space="preserve">figure. The alt text states what the visual encodes and preserves the boundary</w:t>
+      </w:r>
+      <w:r>
+        <w:t xml:space="preserve"> </w:t>
+      </w:r>
+      <w:r>
+        <w:t xml:space="preserve">between deterministic observations and host-dependent diagnostics. Run the</w:t>
+      </w:r>
+      <w:r>
+        <w:t xml:space="preserve"> </w:t>
+      </w:r>
+      <w:r>
+        <w:t xml:space="preserve">opt-in publication migration gate with</w:t>
+      </w:r>
+      <w:r>
+        <w:t xml:space="preserve"> </w:t>
+      </w:r>
+      <w:r>
+        <w:rPr>
+          <w:rStyle w:val="VerbatimChar"/>
+        </w:rPr>
+        <w:t xml:space="preserve">--require-figure-accessibility</w:t>
+      </w:r>
+      <w:r>
+        <w:t xml:space="preserve"> </w:t>
+      </w:r>
+      <w:r>
+        <w:t xml:space="preserve">to verify that every referenced figure has</w:t>
+      </w:r>
+      <w:r>
+        <w:t xml:space="preserve"> </w:t>
+      </w:r>
+      <w:r>
+        <w:t xml:space="preserve">this metadata before promotion.</w:t>
       </w:r>
     </w:p>
     <w:bookmarkEnd w:id="44"/>
@@ -12726,7 +12788,7 @@
         <w:t xml:space="preserve">Python</w:t>
       </w:r>
       <w:r>
-        <w:t xml:space="preserve">: 3.13.11</w:t>
+        <w:t xml:space="preserve">: 3.10.18</w:t>
       </w:r>
     </w:p>
     <w:p>
@@ -12745,7 +12807,7 @@
         <w:t xml:space="preserve">NumPy</w:t>
       </w:r>
       <w:r>
-        <w:t xml:space="preserve">: 2.4.2</w:t>
+        <w:t xml:space="preserve">: 2.2.6</w:t>
       </w:r>
     </w:p>
     <w:p>
@@ -12783,7 +12845,7 @@
         <w:t xml:space="preserve">Generated</w:t>
       </w:r>
       <w:r>
-        <w:t xml:space="preserve">: 2026-07-20T15:59:12Z</w:t>
+        <w:t xml:space="preserve">: 2026-07-24T00:05:39Z</w:t>
       </w:r>
     </w:p>
     <w:bookmarkEnd w:id="110"/>
@@ -13611,7 +13673,7 @@
               <w:pStyle w:val="Compact"/>
             </w:pPr>
             <w:r>
-              <w:t xml:space="preserve">9</w:t>
+              <w:t xml:space="preserve">8</w:t>
             </w:r>
           </w:p>
         </w:tc>
@@ -13659,7 +13721,7 @@
               <w:pStyle w:val="Compact"/>
             </w:pPr>
             <w:r>
-              <w:t xml:space="preserve">19</w:t>
+              <w:t xml:space="preserve">9</w:t>
             </w:r>
           </w:p>
         </w:tc>
@@ -13691,7 +13753,7 @@
                 <w:b/>
                 <w:bCs/>
               </w:rPr>
-              <w:t xml:space="preserve">33</w:t>
+              <w:t xml:space="preserve">22</w:t>
             </w:r>
           </w:p>
         </w:tc>

</xml_diff>

<commit_message>
template_code_project: regenerate outputs for accuracy pass (Six-panel caption, bound reports, receipt)
</commit_message>
<xml_diff>
--- a/projects/templates/template_code_project/output/docx/templates/template_code_project_combined.docx
+++ b/projects/templates/template_code_project/output/docx/templates/template_code_project_combined.docx
@@ -2070,7 +2070,7 @@
         <w:rPr>
           <w:rStyle w:val="VerbatimChar"/>
         </w:rPr>
-        <w:t xml:space="preserve">{{CONFIG_*}}</w:t>
+        <w:t xml:space="preserve">CONFIG_*</w:t>
       </w:r>
       <w:r>
         <w:t xml:space="preserve"> </w:t>
@@ -2085,13 +2085,13 @@
         <w:rPr>
           <w:rStyle w:val="VerbatimChar"/>
         </w:rPr>
-        <w:t xml:space="preserve">{{RESULT_*}}</w:t>
-      </w:r>
-      <w:r>
-        <w:t xml:space="preserve"> </w:t>
-      </w:r>
-      <w:r>
-        <w:t xml:space="preserve">placeholders for numeric values.</w:t>
+        <w:t xml:space="preserve">RESULT_*</w:t>
+      </w:r>
+      <w:r>
+        <w:t xml:space="preserve"> </w:t>
+      </w:r>
+      <w:r>
+        <w:t xml:space="preserve">template tokens for numeric values.</w:t>
       </w:r>
     </w:p>
     <w:p>
@@ -5315,7 +5315,36 @@
           <m:rPr>
             <m:sty m:val="p"/>
           </m:rPr>
-          <m:t>≤</m:t>
+          <m:t>&lt;</m:t>
+        </m:r>
+        <m:r>
+          <m:t>0.3</m:t>
+        </m:r>
+      </m:oMath>
+      <w:r>
+        <w:t xml:space="preserve">; in this grid</w:t>
+      </w:r>
+      <w:r>
+        <w:t xml:space="preserve"> </w:t>
+      </w:r>
+      <m:oMath>
+        <m:r>
+          <m:t>α</m:t>
+        </m:r>
+        <m:r>
+          <m:rPr>
+            <m:sty m:val="p"/>
+          </m:rPr>
+          <m:t>=</m:t>
+        </m:r>
+        <m:r>
+          <m:t>0.01</m:t>
+        </m:r>
+        <m:r>
+          <m:rPr>
+            <m:sty m:val="p"/>
+          </m:rPr>
+          <m:t>,</m:t>
         </m:r>
         <m:r>
           <m:t>0.1</m:t>
@@ -8919,7 +8948,7 @@
           <wp:inline>
             <wp:extent cx="5334000" cy="6237349"/>
             <wp:effectExtent b="0" l="0" r="0" t="0"/>
-            <wp:docPr descr="Figure 4: Four-panel diagnostic from generate_complexity_visualization(). Top left: bars give the empirical iteration count per configured \alpha, coloured by agency category; \alpha=1.0 achieves the global minimum of 1 step(s), while \alpha=0.01 and \alpha=2.5 both saturate at the iteration cap N_{\max}=1000 (slow convergence and divergence respectively). Top right: \log_{10}|f(x)-f(x^\ast)| at termination; the four converged rows reach \approx 10^{-16} (machine precision) while \alpha=0.01 stops near 10^{-9} at the cap. Dashed reference at \log_{10}\varepsilon for \varepsilon= experiment.convergence_tolerance. Bottom left: empirical iterations (solid) versus the smooth proxy 1/(2\alpha(1-\alpha)) (dashed) on log axes — a shape comparison, not a tight count prediction for every \alpha. Bottom right: per-step error contraction factor \rho=|1-\alpha| from the unit-Hessian linear recurrence (eq. ¿eq:scalar_linear_update?); the dashed reference at \rho=1 separates stable bars (left of it) from divergent ones (right)." title="" id="78" name="Picture"/>
+            <wp:docPr descr="Figure 4: Six-panel diagnostic from generate_complexity_visualization() (3×2 grid). Top left: bars give the empirical iteration count per configured \alpha, coloured by agency category; \alpha=1.0 achieves the global minimum of 1 step(s), while \alpha=0.01 saturates at the iteration cap N_{\max}=1000 (slow convergence) and \alpha=2.5 terminates early via a non_finite update (divergence). Top right: \log_{10}|f(x)-f(x^\ast)| at termination; the four converged rows reach \approx 10^{-16} (machine precision) while \alpha=0.01 stops near 10^{-9} at the cap. Dashed reference at \log_{10}\varepsilon for \varepsilon= experiment.convergence_tolerance. Middle left: empirical iterations (solid) versus the smooth proxy 1/(2\alpha(1-\alpha)) (dashed) on log axes — a shape comparison, not a tight count prediction for every \alpha. Middle right: per-step error contraction factor \rho=|1-\alpha| from the unit-Hessian linear recurrence (eq. ¿eq:scalar_linear_update?); the dashed reference at \rho=1 separates stable bars (left of it) from divergent ones (right). Bottom left: stable step-size region width 2/L per backend profile (H=I,2I,5I,10I) with the optimal \alpha^\ast=1/L overlaid. Bottom right: cross-profile contraction curves \rho(\alpha)=|1-\alpha L| with dotted verticals at each 2/L stability boundary." title="" id="78" name="Picture"/>
             <a:graphic>
               <a:graphicData uri="http://schemas.openxmlformats.org/drawingml/2006/picture">
                 <pic:pic>
@@ -8962,7 +8991,7 @@
         <w:pStyle w:val="ImageCaption"/>
       </w:pPr>
       <w:r>
-        <w:t xml:space="preserve">Figure 4: Four-panel diagnostic from</w:t>
+        <w:t xml:space="preserve">Figure 4: Six-panel diagnostic from</w:t>
       </w:r>
       <w:r>
         <w:t xml:space="preserve"> </w:t>
@@ -8974,7 +9003,10 @@
         <w:t xml:space="preserve">generate_complexity_visualization()</w:t>
       </w:r>
       <w:r>
-        <w:t xml:space="preserve">.</w:t>
+        <w:t xml:space="preserve"> </w:t>
+      </w:r>
+      <w:r>
+        <w:t xml:space="preserve">(3×2 grid).</w:t>
       </w:r>
       <w:r>
         <w:t xml:space="preserve"> </w:t>
@@ -9044,30 +9076,7 @@
         <w:t xml:space="preserve"> </w:t>
       </w:r>
       <w:r>
-        <w:t xml:space="preserve">and</w:t>
-      </w:r>
-      <w:r>
-        <w:t xml:space="preserve"> </w:t>
-      </w:r>
-      <m:oMath>
-        <m:r>
-          <m:t>α</m:t>
-        </m:r>
-        <m:r>
-          <m:rPr>
-            <m:sty m:val="p"/>
-          </m:rPr>
-          <m:t>=</m:t>
-        </m:r>
-        <m:r>
-          <m:t>2.5</m:t>
-        </m:r>
-      </m:oMath>
-      <w:r>
-        <w:t xml:space="preserve"> </w:t>
-      </w:r>
-      <w:r>
-        <w:t xml:space="preserve">both saturate at the iteration cap</w:t>
+        <w:t xml:space="preserve">saturates at the iteration cap</w:t>
       </w:r>
       <w:r>
         <w:t xml:space="preserve"> </w:t>
@@ -9102,7 +9111,45 @@
         <w:t xml:space="preserve"> </w:t>
       </w:r>
       <w:r>
-        <w:t xml:space="preserve">(slow convergence and divergence respectively).</w:t>
+        <w:t xml:space="preserve">(slow convergence) and</w:t>
+      </w:r>
+      <w:r>
+        <w:t xml:space="preserve"> </w:t>
+      </w:r>
+      <m:oMath>
+        <m:r>
+          <m:t>α</m:t>
+        </m:r>
+        <m:r>
+          <m:rPr>
+            <m:sty m:val="p"/>
+          </m:rPr>
+          <m:t>=</m:t>
+        </m:r>
+        <m:r>
+          <m:t>2.5</m:t>
+        </m:r>
+      </m:oMath>
+      <w:r>
+        <w:t xml:space="preserve"> </w:t>
+      </w:r>
+      <w:r>
+        <w:t xml:space="preserve">terminates early via a</w:t>
+      </w:r>
+      <w:r>
+        <w:t xml:space="preserve"> </w:t>
+      </w:r>
+      <w:r>
+        <w:rPr>
+          <w:rStyle w:val="VerbatimChar"/>
+        </w:rPr>
+        <w:t xml:space="preserve">non_finite</w:t>
+      </w:r>
+      <w:r>
+        <w:t xml:space="preserve"> </w:t>
+      </w:r>
+      <w:r>
+        <w:t xml:space="preserve">update (divergence).</w:t>
       </w:r>
       <w:r>
         <w:t xml:space="preserve"> </w:t>
@@ -9359,7 +9406,7 @@
           <w:b/>
           <w:bCs/>
         </w:rPr>
-        <w:t xml:space="preserve">Bottom left</w:t>
+        <w:t xml:space="preserve">Middle left</w:t>
       </w:r>
       <w:r>
         <w:t xml:space="preserve">: empirical iterations (solid) versus the smooth proxy</w:t>
@@ -9445,7 +9492,7 @@
           <w:b/>
           <w:bCs/>
         </w:rPr>
-        <w:t xml:space="preserve">Bottom right</w:t>
+        <w:t xml:space="preserve">Middle right</w:t>
       </w:r>
       <w:r>
         <w:t xml:space="preserve">: per-step error contraction factor</w:t>
@@ -9526,6 +9573,237 @@
       </w:r>
       <w:r>
         <w:t xml:space="preserve">separates stable bars (left of it) from divergent ones (right).</w:t>
+      </w:r>
+      <w:r>
+        <w:t xml:space="preserve"> </w:t>
+      </w:r>
+      <w:r>
+        <w:rPr>
+          <w:b/>
+          <w:bCs/>
+        </w:rPr>
+        <w:t xml:space="preserve">Bottom left</w:t>
+      </w:r>
+      <w:r>
+        <w:t xml:space="preserve">: stable step-size region width</w:t>
+      </w:r>
+      <w:r>
+        <w:t xml:space="preserve"> </w:t>
+      </w:r>
+      <m:oMath>
+        <m:r>
+          <m:t>2</m:t>
+        </m:r>
+        <m:r>
+          <m:rPr>
+            <m:sty m:val="p"/>
+          </m:rPr>
+          <m:t>/</m:t>
+        </m:r>
+        <m:r>
+          <m:t>L</m:t>
+        </m:r>
+      </m:oMath>
+      <w:r>
+        <w:t xml:space="preserve"> </w:t>
+      </w:r>
+      <w:r>
+        <w:t xml:space="preserve">per backend profile (</w:t>
+      </w:r>
+      <m:oMath>
+        <m:r>
+          <m:t>H</m:t>
+        </m:r>
+        <m:r>
+          <m:rPr>
+            <m:sty m:val="p"/>
+          </m:rPr>
+          <m:t>=</m:t>
+        </m:r>
+        <m:r>
+          <m:t>I</m:t>
+        </m:r>
+        <m:r>
+          <m:rPr>
+            <m:sty m:val="p"/>
+          </m:rPr>
+          <m:t>,</m:t>
+        </m:r>
+        <m:r>
+          <m:t>2</m:t>
+        </m:r>
+        <m:r>
+          <m:t>I</m:t>
+        </m:r>
+        <m:r>
+          <m:rPr>
+            <m:sty m:val="p"/>
+          </m:rPr>
+          <m:t>,</m:t>
+        </m:r>
+        <m:r>
+          <m:t>5</m:t>
+        </m:r>
+        <m:r>
+          <m:t>I</m:t>
+        </m:r>
+        <m:r>
+          <m:rPr>
+            <m:sty m:val="p"/>
+          </m:rPr>
+          <m:t>,</m:t>
+        </m:r>
+        <m:r>
+          <m:t>10</m:t>
+        </m:r>
+        <m:r>
+          <m:t>I</m:t>
+        </m:r>
+      </m:oMath>
+      <w:r>
+        <w:t xml:space="preserve">) with the optimal</w:t>
+      </w:r>
+      <w:r>
+        <w:t xml:space="preserve"> </w:t>
+      </w:r>
+      <m:oMath>
+        <m:sSup>
+          <m:e>
+            <m:r>
+              <m:t>α</m:t>
+            </m:r>
+          </m:e>
+          <m:sup>
+            <m:r>
+              <m:rPr>
+                <m:sty m:val="p"/>
+              </m:rPr>
+              <m:t>*</m:t>
+            </m:r>
+          </m:sup>
+        </m:sSup>
+        <m:r>
+          <m:rPr>
+            <m:sty m:val="p"/>
+          </m:rPr>
+          <m:t>=</m:t>
+        </m:r>
+        <m:r>
+          <m:t>1</m:t>
+        </m:r>
+        <m:r>
+          <m:rPr>
+            <m:sty m:val="p"/>
+          </m:rPr>
+          <m:t>/</m:t>
+        </m:r>
+        <m:r>
+          <m:t>L</m:t>
+        </m:r>
+      </m:oMath>
+      <w:r>
+        <w:t xml:space="preserve"> </w:t>
+      </w:r>
+      <w:r>
+        <w:t xml:space="preserve">overlaid.</w:t>
+      </w:r>
+      <w:r>
+        <w:t xml:space="preserve"> </w:t>
+      </w:r>
+      <w:r>
+        <w:rPr>
+          <w:b/>
+          <w:bCs/>
+        </w:rPr>
+        <w:t xml:space="preserve">Bottom right</w:t>
+      </w:r>
+      <w:r>
+        <w:t xml:space="preserve">: cross-profile contraction curves</w:t>
+      </w:r>
+      <w:r>
+        <w:t xml:space="preserve"> </w:t>
+      </w:r>
+      <m:oMath>
+        <m:r>
+          <m:t>ρ</m:t>
+        </m:r>
+        <m:r>
+          <m:rPr>
+            <m:sty m:val="p"/>
+          </m:rPr>
+          <m:t>(</m:t>
+        </m:r>
+        <m:r>
+          <m:t>α</m:t>
+        </m:r>
+        <m:r>
+          <m:rPr>
+            <m:sty m:val="p"/>
+          </m:rPr>
+          <m:t>)</m:t>
+        </m:r>
+        <m:r>
+          <m:rPr>
+            <m:sty m:val="p"/>
+          </m:rPr>
+          <m:t>=</m:t>
+        </m:r>
+        <m:r>
+          <m:rPr>
+            <m:sty m:val="p"/>
+          </m:rPr>
+          <m:t>|</m:t>
+        </m:r>
+        <m:r>
+          <m:t>1</m:t>
+        </m:r>
+        <m:r>
+          <m:rPr>
+            <m:sty m:val="p"/>
+          </m:rPr>
+          <m:t>−</m:t>
+        </m:r>
+        <m:r>
+          <m:t>α</m:t>
+        </m:r>
+        <m:r>
+          <m:t>L</m:t>
+        </m:r>
+        <m:r>
+          <m:rPr>
+            <m:sty m:val="p"/>
+          </m:rPr>
+          <m:t>|</m:t>
+        </m:r>
+      </m:oMath>
+      <w:r>
+        <w:t xml:space="preserve"> </w:t>
+      </w:r>
+      <w:r>
+        <w:t xml:space="preserve">with dotted verticals at each</w:t>
+      </w:r>
+      <w:r>
+        <w:t xml:space="preserve"> </w:t>
+      </w:r>
+      <m:oMath>
+        <m:r>
+          <m:t>2</m:t>
+        </m:r>
+        <m:r>
+          <m:rPr>
+            <m:sty m:val="p"/>
+          </m:rPr>
+          <m:t>/</m:t>
+        </m:r>
+        <m:r>
+          <m:t>L</m:t>
+        </m:r>
+      </m:oMath>
+      <w:r>
+        <w:t xml:space="preserve"> </w:t>
+      </w:r>
+      <w:r>
+        <w:t xml:space="preserve">stability boundary.</w:t>
       </w:r>
     </w:p>
     <w:bookmarkEnd w:id="80"/>
@@ -12788,7 +13066,7 @@
         <w:t xml:space="preserve">Python</w:t>
       </w:r>
       <w:r>
-        <w:t xml:space="preserve">: 3.10.18</w:t>
+        <w:t xml:space="preserve">: 3.12.13</w:t>
       </w:r>
     </w:p>
     <w:p>
@@ -12807,7 +13085,7 @@
         <w:t xml:space="preserve">NumPy</w:t>
       </w:r>
       <w:r>
-        <w:t xml:space="preserve">: 2.2.6</w:t>
+        <w:t xml:space="preserve">: 2.4.2</w:t>
       </w:r>
     </w:p>
     <w:p>
@@ -12845,7 +13123,7 @@
         <w:t xml:space="preserve">Generated</w:t>
       </w:r>
       <w:r>
-        <w:t xml:space="preserve">: 2026-07-24T00:05:39Z</w:t>
+        <w:t xml:space="preserve">: 2026-08-03T00:12:48Z</w:t>
       </w:r>
     </w:p>
     <w:bookmarkEnd w:id="110"/>
@@ -13673,7 +13951,7 @@
               <w:pStyle w:val="Compact"/>
             </w:pPr>
             <w:r>
-              <w:t xml:space="preserve">8</w:t>
+              <w:t xml:space="preserve">9</w:t>
             </w:r>
           </w:p>
         </w:tc>
@@ -13721,7 +13999,7 @@
               <w:pStyle w:val="Compact"/>
             </w:pPr>
             <w:r>
-              <w:t xml:space="preserve">9</w:t>
+              <w:t xml:space="preserve">25</w:t>
             </w:r>
           </w:p>
         </w:tc>
@@ -13753,7 +14031,7 @@
                 <w:b/>
                 <w:bCs/>
               </w:rPr>
-              <w:t xml:space="preserve">22</w:t>
+              <w:t xml:space="preserve">39</w:t>
             </w:r>
           </w:p>
         </w:tc>
@@ -14603,13 +14881,13 @@
         <w:rPr>
           <w:rStyle w:val="VerbatimChar"/>
         </w:rPr>
-        <w:t xml:space="preserve">{{RESULT_*}}</w:t>
-      </w:r>
-      <w:r>
-        <w:t xml:space="preserve"> </w:t>
-      </w:r>
-      <w:r>
-        <w:t xml:space="preserve">substitution (</w:t>
+        <w:t xml:space="preserve">RESULT_*</w:t>
+      </w:r>
+      <w:r>
+        <w:t xml:space="preserve"> </w:t>
+      </w:r>
+      <w:r>
+        <w:t xml:space="preserve">token substitution (</w:t>
       </w:r>
       <w:r>
         <w:rPr>

</xml_diff>